<commit_message>
ansible - playbook updated
</commit_message>
<xml_diff>
--- a/Ansible/5-playbook.docx
+++ b/Ansible/5-playbook.docx
@@ -1,6 +1,6 @@
 
 <file path=word/document.xml><?xml version="1.0" encoding="utf-8"?>
-<w:document xmlns:wpc="http://schemas.microsoft.com/office/word/2010/wordprocessingCanvas" xmlns:cx="http://schemas.microsoft.com/office/drawing/2014/chartex" xmlns:cx1="http://schemas.microsoft.com/office/drawing/2015/9/8/chartex" xmlns:cx2="http://schemas.microsoft.com/office/drawing/2015/10/21/chartex" xmlns:cx3="http://schemas.microsoft.com/office/drawing/2016/5/9/chartex" xmlns:cx4="http://schemas.microsoft.com/office/drawing/2016/5/10/chartex" xmlns:cx5="http://schemas.microsoft.com/office/drawing/2016/5/11/chartex" xmlns:cx6="http://schemas.microsoft.com/office/drawing/2016/5/12/chartex" xmlns:cx7="http://schemas.microsoft.com/office/drawing/2016/5/13/chartex" xmlns:cx8="http://schemas.microsoft.com/office/drawing/2016/5/14/chartex" xmlns:mc="http://schemas.openxmlformats.org/markup-compatibility/2006" xmlns:aink="http://schemas.microsoft.com/office/drawing/2016/ink" xmlns:am3d="http://schemas.microsoft.com/office/drawing/2017/model3d" xmlns:o="urn:schemas-microsoft-com:office:office" xmlns:oel="http://schemas.microsoft.com/office/2019/extlst" xmlns:r="http://schemas.openxmlformats.org/officeDocument/2006/relationships" xmlns:m="http://schemas.openxmlformats.org/officeDocument/2006/math" xmlns:v="urn:schemas-microsoft-com:vml" xmlns:wp14="http://schemas.microsoft.com/office/word/2010/wordprocessingDrawing" xmlns:wp="http://schemas.openxmlformats.org/drawingml/2006/wordprocessingDrawing" xmlns:w10="urn:schemas-microsoft-com:office:word" xmlns:w="http://schemas.openxmlformats.org/wordprocessingml/2006/main" xmlns:w14="http://schemas.microsoft.com/office/word/2010/wordml" xmlns:w15="http://schemas.microsoft.com/office/word/2012/wordml" xmlns:w16cex="http://schemas.microsoft.com/office/word/2018/wordml/cex" xmlns:w16cid="http://schemas.microsoft.com/office/word/2016/wordml/cid" xmlns:w16="http://schemas.microsoft.com/office/word/2018/wordml" xmlns:w16sdtdh="http://schemas.microsoft.com/office/word/2020/wordml/sdtdatahash" xmlns:w16se="http://schemas.microsoft.com/office/word/2015/wordml/symex" xmlns:wpg="http://schemas.microsoft.com/office/word/2010/wordprocessingGroup" xmlns:wpi="http://schemas.microsoft.com/office/word/2010/wordprocessingInk" xmlns:wne="http://schemas.microsoft.com/office/word/2006/wordml" xmlns:wps="http://schemas.microsoft.com/office/word/2010/wordprocessingShape" mc:Ignorable="w14 w15 w16se w16cid w16 w16cex w16sdtdh wp14">
+<w:document xmlns:wpc="http://schemas.microsoft.com/office/word/2010/wordprocessingCanvas" xmlns:cx="http://schemas.microsoft.com/office/drawing/2014/chartex" xmlns:cx1="http://schemas.microsoft.com/office/drawing/2015/9/8/chartex" xmlns:cx2="http://schemas.microsoft.com/office/drawing/2015/10/21/chartex" xmlns:cx3="http://schemas.microsoft.com/office/drawing/2016/5/9/chartex" xmlns:cx4="http://schemas.microsoft.com/office/drawing/2016/5/10/chartex" xmlns:cx5="http://schemas.microsoft.com/office/drawing/2016/5/11/chartex" xmlns:cx6="http://schemas.microsoft.com/office/drawing/2016/5/12/chartex" xmlns:cx7="http://schemas.microsoft.com/office/drawing/2016/5/13/chartex" xmlns:cx8="http://schemas.microsoft.com/office/drawing/2016/5/14/chartex" xmlns:mc="http://schemas.openxmlformats.org/markup-compatibility/2006" xmlns:aink="http://schemas.microsoft.com/office/drawing/2016/ink" xmlns:am3d="http://schemas.microsoft.com/office/drawing/2017/model3d" xmlns:o="urn:schemas-microsoft-com:office:office" xmlns:oel="http://schemas.microsoft.com/office/2019/extlst" xmlns:r="http://schemas.openxmlformats.org/officeDocument/2006/relationships" xmlns:m="http://schemas.openxmlformats.org/officeDocument/2006/math" xmlns:v="urn:schemas-microsoft-com:vml" xmlns:wp14="http://schemas.microsoft.com/office/word/2010/wordprocessingDrawing" xmlns:wp="http://schemas.openxmlformats.org/drawingml/2006/wordprocessingDrawing" xmlns:w10="urn:schemas-microsoft-com:office:word" xmlns:w="http://schemas.openxmlformats.org/wordprocessingml/2006/main" xmlns:w14="http://schemas.microsoft.com/office/word/2010/wordml" xmlns:w15="http://schemas.microsoft.com/office/word/2012/wordml" xmlns:w16cex="http://schemas.microsoft.com/office/word/2018/wordml/cex" xmlns:w16cid="http://schemas.microsoft.com/office/word/2016/wordml/cid" xmlns:w16="http://schemas.microsoft.com/office/word/2018/wordml" xmlns:w16du="http://schemas.microsoft.com/office/word/2023/wordml/word16du" xmlns:w16sdtdh="http://schemas.microsoft.com/office/word/2020/wordml/sdtdatahash" xmlns:w16sdtfl="http://schemas.microsoft.com/office/word/2024/wordml/sdtformatlock" xmlns:w16se="http://schemas.microsoft.com/office/word/2015/wordml/symex" xmlns:wpg="http://schemas.microsoft.com/office/word/2010/wordprocessingGroup" xmlns:wpi="http://schemas.microsoft.com/office/word/2010/wordprocessingInk" xmlns:wne="http://schemas.microsoft.com/office/word/2006/wordml" xmlns:wps="http://schemas.microsoft.com/office/word/2010/wordprocessingShape" mc:Ignorable="w14 w15 w16se w16cid w16 w16cex w16sdtdh w16sdtfl w16du wp14">
   <w:body>
     <w:p>
       <w:pPr>
@@ -2381,6 +2381,7 @@
     </w:p>
     <w:p>
       <w:pPr>
+        <w:spacing w:after="60"/>
         <w:jc w:val="both"/>
         <w:rPr>
           <w:rFonts w:asciiTheme="majorBidi" w:hAnsiTheme="majorBidi" w:cstheme="majorBidi"/>
@@ -3130,9 +3131,9 @@
           <w:sz w:val="28"/>
           <w:szCs w:val="28"/>
         </w:rPr>
-        <w:t>_port</w:t>
-      </w:r>
-      <w:proofErr w:type="spellEnd"/>
+        <w:t>_</w:t>
+      </w:r>
+      <w:proofErr w:type="gramStart"/>
       <w:r>
         <w:rPr>
           <w:rFonts w:asciiTheme="majorBidi" w:hAnsiTheme="majorBidi" w:cstheme="majorBidi"/>
@@ -3143,8 +3144,22 @@
           <w:sz w:val="28"/>
           <w:szCs w:val="28"/>
         </w:rPr>
+        <w:t>port</w:t>
+      </w:r>
+      <w:proofErr w:type="spellEnd"/>
+      <w:r>
+        <w:rPr>
+          <w:rFonts w:asciiTheme="majorBidi" w:hAnsiTheme="majorBidi" w:cstheme="majorBidi"/>
+          <w:b/>
+          <w:bCs/>
+          <w:i/>
+          <w:iCs/>
+          <w:sz w:val="28"/>
+          <w:szCs w:val="28"/>
+        </w:rPr>
         <w:t xml:space="preserve"> }}"</w:t>
       </w:r>
+      <w:proofErr w:type="gramEnd"/>
     </w:p>
     <w:p>
       <w:pPr>
@@ -3526,7 +3541,7 @@
     </w:p>
     <w:p>
       <w:pPr>
-        <w:spacing w:after="80"/>
+        <w:spacing w:after="60"/>
         <w:jc w:val="both"/>
         <w:rPr>
           <w:rFonts w:asciiTheme="majorBidi" w:hAnsiTheme="majorBidi" w:cstheme="majorBidi"/>
@@ -3559,6 +3574,7 @@
     </w:p>
     <w:p>
       <w:pPr>
+        <w:spacing w:after="100"/>
         <w:jc w:val="both"/>
         <w:rPr>
           <w:rFonts w:asciiTheme="majorBidi" w:hAnsiTheme="majorBidi" w:cstheme="majorBidi"/>
@@ -3940,8 +3956,8 @@
         <w:jc w:val="both"/>
         <w:rPr>
           <w:rFonts w:asciiTheme="majorBidi" w:hAnsiTheme="majorBidi" w:cstheme="majorBidi"/>
-          <w:sz w:val="32"/>
-          <w:szCs w:val="32"/>
+          <w:sz w:val="28"/>
+          <w:szCs w:val="28"/>
         </w:rPr>
       </w:pPr>
     </w:p>
@@ -4359,6 +4375,7 @@
     </w:p>
     <w:p>
       <w:pPr>
+        <w:spacing w:after="120"/>
         <w:jc w:val="both"/>
         <w:rPr>
           <w:rFonts w:asciiTheme="majorBidi" w:hAnsiTheme="majorBidi" w:cstheme="majorBidi"/>
@@ -4819,7 +4836,7 @@
         <mc:AlternateContent>
           <mc:Choice Requires="wps">
             <w:drawing>
-              <wp:anchor distT="0" distB="0" distL="114300" distR="114300" simplePos="0" relativeHeight="251666432" behindDoc="0" locked="0" layoutInCell="1" allowOverlap="1" wp14:anchorId="46C25322" wp14:editId="3BEACDDB">
+              <wp:anchor distT="0" distB="0" distL="114300" distR="114300" simplePos="0" relativeHeight="251666432" behindDoc="0" locked="0" layoutInCell="1" allowOverlap="1" wp14:anchorId="46C25322" wp14:editId="6E491ACF">
                 <wp:simplePos x="0" y="0"/>
                 <wp:positionH relativeFrom="margin">
                   <wp:align>left</wp:align>
@@ -4827,8 +4844,8 @@
                 <wp:positionV relativeFrom="paragraph">
                   <wp:posOffset>285749</wp:posOffset>
                 </wp:positionV>
-                <wp:extent cx="2028825" cy="971550"/>
-                <wp:effectExtent l="0" t="0" r="28575" b="19050"/>
+                <wp:extent cx="1623060" cy="971550"/>
+                <wp:effectExtent l="0" t="0" r="15240" b="19050"/>
                 <wp:wrapNone/>
                 <wp:docPr id="8" name="Rectangle 8"/>
                 <wp:cNvGraphicFramePr/>
@@ -4839,7 +4856,7 @@
                       <wps:spPr>
                         <a:xfrm>
                           <a:off x="0" y="0"/>
-                          <a:ext cx="2028825" cy="971550"/>
+                          <a:ext cx="1623060" cy="971550"/>
                         </a:xfrm>
                         <a:prstGeom prst="rect">
                           <a:avLst/>
@@ -5015,7 +5032,7 @@
           </mc:Choice>
           <mc:Fallback>
             <w:pict>
-              <v:rect w14:anchorId="46C25322" id="Rectangle 8" o:spid="_x0000_s1033" style="position:absolute;left:0;text-align:left;margin-left:0;margin-top:22.5pt;width:159.75pt;height:76.5pt;z-index:251666432;visibility:visible;mso-wrap-style:square;mso-width-percent:0;mso-height-percent:0;mso-wrap-distance-left:9pt;mso-wrap-distance-top:0;mso-wrap-distance-right:9pt;mso-wrap-distance-bottom:0;mso-position-horizontal:left;mso-position-horizontal-relative:margin;mso-position-vertical:absolute;mso-position-vertical-relative:text;mso-width-percent:0;mso-height-percent:0;mso-width-relative:margin;mso-height-relative:margin;v-text-anchor:middle" o:gfxdata="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" fillcolor="black [3200]" strokecolor="black [480]" strokeweight="1pt">
+              <v:rect w14:anchorId="46C25322" id="Rectangle 8" o:spid="_x0000_s1033" style="position:absolute;left:0;text-align:left;margin-left:0;margin-top:22.5pt;width:127.8pt;height:76.5pt;z-index:251666432;visibility:visible;mso-wrap-style:square;mso-width-percent:0;mso-height-percent:0;mso-wrap-distance-left:9pt;mso-wrap-distance-top:0;mso-wrap-distance-right:9pt;mso-wrap-distance-bottom:0;mso-position-horizontal:left;mso-position-horizontal-relative:margin;mso-position-vertical:absolute;mso-position-vertical-relative:text;mso-width-percent:0;mso-height-percent:0;mso-width-relative:margin;mso-height-relative:margin;v-text-anchor:middle" o:gfxdata="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" fillcolor="black [3200]" strokecolor="black [480]" strokeweight="1pt">
                 <v:textbox>
                   <w:txbxContent>
                     <w:p>
@@ -5635,6 +5652,7 @@
     </w:p>
     <w:p>
       <w:pPr>
+        <w:spacing w:after="60"/>
         <w:jc w:val="both"/>
         <w:rPr>
           <w:rFonts w:asciiTheme="majorBidi" w:hAnsiTheme="majorBidi" w:cstheme="majorBidi"/>
@@ -5657,6 +5675,7 @@
     </w:p>
     <w:p>
       <w:pPr>
+        <w:spacing w:after="120"/>
         <w:jc w:val="both"/>
         <w:rPr>
           <w:rFonts w:asciiTheme="majorBidi" w:hAnsiTheme="majorBidi" w:cstheme="majorBidi"/>
@@ -5742,13 +5761,23 @@
         </w:rPr>
         <w:t xml:space="preserve">, </w:t>
       </w:r>
-      <w:r>
-        <w:rPr>
-          <w:rFonts w:asciiTheme="majorBidi" w:hAnsiTheme="majorBidi" w:cstheme="majorBidi"/>
-          <w:sz w:val="28"/>
-          <w:szCs w:val="28"/>
-        </w:rPr>
-        <w:t>If nginx already exists</w:t>
+      <w:proofErr w:type="gramStart"/>
+      <w:r>
+        <w:rPr>
+          <w:rFonts w:asciiTheme="majorBidi" w:hAnsiTheme="majorBidi" w:cstheme="majorBidi"/>
+          <w:sz w:val="28"/>
+          <w:szCs w:val="28"/>
+        </w:rPr>
+        <w:t>If</w:t>
+      </w:r>
+      <w:proofErr w:type="gramEnd"/>
+      <w:r>
+        <w:rPr>
+          <w:rFonts w:asciiTheme="majorBidi" w:hAnsiTheme="majorBidi" w:cstheme="majorBidi"/>
+          <w:sz w:val="28"/>
+          <w:szCs w:val="28"/>
+        </w:rPr>
+        <w:t xml:space="preserve"> nginx already exists</w:t>
       </w:r>
       <w:r>
         <w:rPr>
@@ -8811,6 +8840,7 @@
           <w:ilvl w:val="0"/>
           <w:numId w:val="12"/>
         </w:numPr>
+        <w:spacing w:after="100"/>
         <w:ind w:left="360"/>
         <w:jc w:val="both"/>
         <w:rPr>
@@ -8859,16 +8889,16 @@
         <mc:AlternateContent>
           <mc:Choice Requires="wps">
             <w:drawing>
-              <wp:anchor distT="0" distB="0" distL="114300" distR="114300" simplePos="0" relativeHeight="251670528" behindDoc="0" locked="0" layoutInCell="1" allowOverlap="1" wp14:anchorId="26578B47" wp14:editId="7513EA97">
+              <wp:anchor distT="0" distB="0" distL="114300" distR="114300" simplePos="0" relativeHeight="251670528" behindDoc="0" locked="0" layoutInCell="1" allowOverlap="1" wp14:anchorId="26578B47" wp14:editId="00FF1C1C">
                 <wp:simplePos x="0" y="0"/>
                 <wp:positionH relativeFrom="margin">
                   <wp:align>left</wp:align>
                 </wp:positionH>
                 <wp:positionV relativeFrom="paragraph">
-                  <wp:posOffset>305435</wp:posOffset>
+                  <wp:posOffset>283845</wp:posOffset>
                 </wp:positionV>
-                <wp:extent cx="1752600" cy="1619250"/>
-                <wp:effectExtent l="0" t="0" r="19050" b="19050"/>
+                <wp:extent cx="1752600" cy="1607820"/>
+                <wp:effectExtent l="0" t="0" r="19050" b="11430"/>
                 <wp:wrapNone/>
                 <wp:docPr id="12" name="Rectangle 12"/>
                 <wp:cNvGraphicFramePr/>
@@ -8879,7 +8909,7 @@
                       <wps:spPr>
                         <a:xfrm>
                           <a:off x="0" y="0"/>
-                          <a:ext cx="1752600" cy="1619250"/>
+                          <a:ext cx="1752600" cy="1607820"/>
                         </a:xfrm>
                         <a:prstGeom prst="rect">
                           <a:avLst/>
@@ -9167,7 +9197,7 @@
           </mc:Choice>
           <mc:Fallback>
             <w:pict>
-              <v:rect w14:anchorId="26578B47" id="Rectangle 12" o:spid="_x0000_s1037" style="position:absolute;left:0;text-align:left;margin-left:0;margin-top:24.05pt;width:138pt;height:127.5pt;z-index:251670528;visibility:visible;mso-wrap-style:square;mso-width-percent:0;mso-height-percent:0;mso-wrap-distance-left:9pt;mso-wrap-distance-top:0;mso-wrap-distance-right:9pt;mso-wrap-distance-bottom:0;mso-position-horizontal:left;mso-position-horizontal-relative:margin;mso-position-vertical:absolute;mso-position-vertical-relative:text;mso-width-percent:0;mso-height-percent:0;mso-width-relative:margin;mso-height-relative:margin;v-text-anchor:middle" o:gfxdata="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" fillcolor="black [3200]" strokecolor="black [480]" strokeweight="1pt">
+              <v:rect w14:anchorId="26578B47" id="Rectangle 12" o:spid="_x0000_s1037" style="position:absolute;left:0;text-align:left;margin-left:0;margin-top:22.35pt;width:138pt;height:126.6pt;z-index:251670528;visibility:visible;mso-wrap-style:square;mso-width-percent:0;mso-height-percent:0;mso-wrap-distance-left:9pt;mso-wrap-distance-top:0;mso-wrap-distance-right:9pt;mso-wrap-distance-bottom:0;mso-position-horizontal:left;mso-position-horizontal-relative:margin;mso-position-vertical:absolute;mso-position-vertical-relative:text;mso-width-percent:0;mso-height-percent:0;mso-width-relative:margin;mso-height-relative:margin;v-text-anchor:middle" o:gfxdata="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" fillcolor="black [3200]" strokecolor="black [480]" strokeweight="1pt">
                 <v:textbox>
                   <w:txbxContent>
                     <w:p>
@@ -9490,8 +9520,8 @@
         <w:jc w:val="both"/>
         <w:rPr>
           <w:rFonts w:asciiTheme="majorBidi" w:hAnsiTheme="majorBidi" w:cstheme="majorBidi"/>
-          <w:sz w:val="28"/>
-          <w:szCs w:val="28"/>
+          <w:sz w:val="20"/>
+          <w:szCs w:val="20"/>
         </w:rPr>
       </w:pPr>
     </w:p>
@@ -9689,16 +9719,16 @@
         <mc:AlternateContent>
           <mc:Choice Requires="wps">
             <w:drawing>
-              <wp:anchor distT="0" distB="0" distL="114300" distR="114300" simplePos="0" relativeHeight="251671552" behindDoc="0" locked="0" layoutInCell="1" allowOverlap="1" wp14:anchorId="513F9F7E" wp14:editId="3157D09E">
+              <wp:anchor distT="0" distB="0" distL="114300" distR="114300" simplePos="0" relativeHeight="251671552" behindDoc="0" locked="0" layoutInCell="1" allowOverlap="1" wp14:anchorId="513F9F7E" wp14:editId="1CC48214">
                 <wp:simplePos x="0" y="0"/>
                 <wp:positionH relativeFrom="column">
-                  <wp:posOffset>476250</wp:posOffset>
+                  <wp:posOffset>480061</wp:posOffset>
                 </wp:positionH>
                 <wp:positionV relativeFrom="paragraph">
-                  <wp:posOffset>295275</wp:posOffset>
+                  <wp:posOffset>296545</wp:posOffset>
                 </wp:positionV>
-                <wp:extent cx="4048125" cy="1943100"/>
-                <wp:effectExtent l="0" t="0" r="28575" b="19050"/>
+                <wp:extent cx="2468880" cy="1943100"/>
+                <wp:effectExtent l="0" t="0" r="26670" b="19050"/>
                 <wp:wrapNone/>
                 <wp:docPr id="13" name="Rectangle 13"/>
                 <wp:cNvGraphicFramePr/>
@@ -9709,7 +9739,7 @@
                       <wps:spPr>
                         <a:xfrm>
                           <a:off x="0" y="0"/>
-                          <a:ext cx="4048125" cy="1943100"/>
+                          <a:ext cx="2468880" cy="1943100"/>
                         </a:xfrm>
                         <a:prstGeom prst="rect">
                           <a:avLst/>
@@ -10070,7 +10100,7 @@
           </mc:Choice>
           <mc:Fallback>
             <w:pict>
-              <v:rect w14:anchorId="513F9F7E" id="Rectangle 13" o:spid="_x0000_s1038" style="position:absolute;left:0;text-align:left;margin-left:37.5pt;margin-top:23.25pt;width:318.75pt;height:153pt;z-index:251671552;visibility:visible;mso-wrap-style:square;mso-width-percent:0;mso-height-percent:0;mso-wrap-distance-left:9pt;mso-wrap-distance-top:0;mso-wrap-distance-right:9pt;mso-wrap-distance-bottom:0;mso-position-horizontal:absolute;mso-position-horizontal-relative:text;mso-position-vertical:absolute;mso-position-vertical-relative:text;mso-width-percent:0;mso-height-percent:0;mso-width-relative:margin;mso-height-relative:margin;v-text-anchor:middle" o:gfxdata="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" fillcolor="black [3200]" strokecolor="black [480]" strokeweight="1pt">
+              <v:rect w14:anchorId="513F9F7E" id="Rectangle 13" o:spid="_x0000_s1038" style="position:absolute;left:0;text-align:left;margin-left:37.8pt;margin-top:23.35pt;width:194.4pt;height:153pt;z-index:251671552;visibility:visible;mso-wrap-style:square;mso-width-percent:0;mso-height-percent:0;mso-wrap-distance-left:9pt;mso-wrap-distance-top:0;mso-wrap-distance-right:9pt;mso-wrap-distance-bottom:0;mso-position-horizontal:absolute;mso-position-horizontal-relative:text;mso-position-vertical:absolute;mso-position-vertical-relative:text;mso-width-percent:0;mso-height-percent:0;mso-width-relative:margin;mso-height-relative:margin;v-text-anchor:middle" o:gfxdata="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" fillcolor="black [3200]" strokecolor="black [480]" strokeweight="1pt">
                 <v:textbox>
                   <w:txbxContent>
                     <w:p>
@@ -10678,16 +10708,16 @@
         <mc:AlternateContent>
           <mc:Choice Requires="wps">
             <w:drawing>
-              <wp:anchor distT="0" distB="0" distL="114300" distR="114300" simplePos="0" relativeHeight="251672576" behindDoc="0" locked="0" layoutInCell="1" allowOverlap="1" wp14:anchorId="622D434E" wp14:editId="32E1D3B7">
+              <wp:anchor distT="0" distB="0" distL="114300" distR="114300" simplePos="0" relativeHeight="251672576" behindDoc="0" locked="0" layoutInCell="1" allowOverlap="1" wp14:anchorId="622D434E" wp14:editId="36A2B19A">
                 <wp:simplePos x="0" y="0"/>
                 <wp:positionH relativeFrom="column">
-                  <wp:posOffset>447675</wp:posOffset>
+                  <wp:posOffset>449580</wp:posOffset>
                 </wp:positionH>
                 <wp:positionV relativeFrom="paragraph">
                   <wp:posOffset>300355</wp:posOffset>
                 </wp:positionV>
-                <wp:extent cx="2095500" cy="2609850"/>
-                <wp:effectExtent l="0" t="0" r="19050" b="19050"/>
+                <wp:extent cx="2087880" cy="2609850"/>
+                <wp:effectExtent l="0" t="0" r="26670" b="19050"/>
                 <wp:wrapNone/>
                 <wp:docPr id="14" name="Rectangle 14"/>
                 <wp:cNvGraphicFramePr/>
@@ -10698,7 +10728,7 @@
                       <wps:spPr>
                         <a:xfrm>
                           <a:off x="0" y="0"/>
-                          <a:ext cx="2095500" cy="2609850"/>
+                          <a:ext cx="2087880" cy="2609850"/>
                         </a:xfrm>
                         <a:prstGeom prst="rect">
                           <a:avLst/>
@@ -11154,7 +11184,7 @@
           </mc:Choice>
           <mc:Fallback>
             <w:pict>
-              <v:rect w14:anchorId="622D434E" id="Rectangle 14" o:spid="_x0000_s1039" style="position:absolute;left:0;text-align:left;margin-left:35.25pt;margin-top:23.65pt;width:165pt;height:205.5pt;z-index:251672576;visibility:visible;mso-wrap-style:square;mso-width-percent:0;mso-height-percent:0;mso-wrap-distance-left:9pt;mso-wrap-distance-top:0;mso-wrap-distance-right:9pt;mso-wrap-distance-bottom:0;mso-position-horizontal:absolute;mso-position-horizontal-relative:text;mso-position-vertical:absolute;mso-position-vertical-relative:text;mso-width-percent:0;mso-height-percent:0;mso-width-relative:margin;mso-height-relative:margin;v-text-anchor:middle" o:gfxdata="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" fillcolor="black [3200]" strokecolor="black [480]" strokeweight="1pt">
+              <v:rect w14:anchorId="622D434E" id="Rectangle 14" o:spid="_x0000_s1039" style="position:absolute;left:0;text-align:left;margin-left:35.4pt;margin-top:23.65pt;width:164.4pt;height:205.5pt;z-index:251672576;visibility:visible;mso-wrap-style:square;mso-width-percent:0;mso-height-percent:0;mso-wrap-distance-left:9pt;mso-wrap-distance-top:0;mso-wrap-distance-right:9pt;mso-wrap-distance-bottom:0;mso-position-horizontal:absolute;mso-position-horizontal-relative:text;mso-position-vertical:absolute;mso-position-vertical-relative:text;mso-width-percent:0;mso-height-percent:0;mso-width-relative:margin;mso-height-relative:margin;v-text-anchor:middle" o:gfxdata="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" fillcolor="black [3200]" strokecolor="black [480]" strokeweight="1pt">
                 <v:textbox>
                   <w:txbxContent>
                     <w:p>
@@ -12370,15 +12400,15 @@
         <mc:AlternateContent>
           <mc:Choice Requires="wps">
             <w:drawing>
-              <wp:anchor distT="0" distB="0" distL="114300" distR="114300" simplePos="0" relativeHeight="251674624" behindDoc="0" locked="0" layoutInCell="1" allowOverlap="1" wp14:anchorId="632382CC" wp14:editId="29DB05A5">
+              <wp:anchor distT="0" distB="0" distL="114300" distR="114300" simplePos="0" relativeHeight="251674624" behindDoc="0" locked="0" layoutInCell="1" allowOverlap="1" wp14:anchorId="632382CC" wp14:editId="1F3C50AF">
                 <wp:simplePos x="0" y="0"/>
                 <wp:positionH relativeFrom="column">
                   <wp:posOffset>228600</wp:posOffset>
                 </wp:positionH>
                 <wp:positionV relativeFrom="paragraph">
-                  <wp:posOffset>283845</wp:posOffset>
+                  <wp:posOffset>281940</wp:posOffset>
                 </wp:positionV>
-                <wp:extent cx="2952750" cy="971550"/>
+                <wp:extent cx="2133600" cy="971550"/>
                 <wp:effectExtent l="0" t="0" r="19050" b="19050"/>
                 <wp:wrapNone/>
                 <wp:docPr id="16" name="Rectangle 16"/>
@@ -12390,7 +12420,7 @@
                       <wps:spPr>
                         <a:xfrm>
                           <a:off x="0" y="0"/>
-                          <a:ext cx="2952750" cy="971550"/>
+                          <a:ext cx="2133600" cy="971550"/>
                         </a:xfrm>
                         <a:prstGeom prst="rect">
                           <a:avLst/>
@@ -12565,6 +12595,9 @@
                     </wps:wsp>
                   </a:graphicData>
                 </a:graphic>
+                <wp14:sizeRelH relativeFrom="margin">
+                  <wp14:pctWidth>0</wp14:pctWidth>
+                </wp14:sizeRelH>
                 <wp14:sizeRelV relativeFrom="margin">
                   <wp14:pctHeight>0</wp14:pctHeight>
                 </wp14:sizeRelV>
@@ -12573,7 +12606,7 @@
           </mc:Choice>
           <mc:Fallback>
             <w:pict>
-              <v:rect w14:anchorId="632382CC" id="Rectangle 16" o:spid="_x0000_s1041" style="position:absolute;left:0;text-align:left;margin-left:18pt;margin-top:22.35pt;width:232.5pt;height:76.5pt;z-index:251674624;visibility:visible;mso-wrap-style:square;mso-height-percent:0;mso-wrap-distance-left:9pt;mso-wrap-distance-top:0;mso-wrap-distance-right:9pt;mso-wrap-distance-bottom:0;mso-position-horizontal:absolute;mso-position-horizontal-relative:text;mso-position-vertical:absolute;mso-position-vertical-relative:text;mso-height-percent:0;mso-height-relative:margin;v-text-anchor:middle" o:gfxdata="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" fillcolor="black [3200]" strokecolor="black [480]" strokeweight="1pt">
+              <v:rect w14:anchorId="632382CC" id="Rectangle 16" o:spid="_x0000_s1041" style="position:absolute;left:0;text-align:left;margin-left:18pt;margin-top:22.2pt;width:168pt;height:76.5pt;z-index:251674624;visibility:visible;mso-wrap-style:square;mso-width-percent:0;mso-height-percent:0;mso-wrap-distance-left:9pt;mso-wrap-distance-top:0;mso-wrap-distance-right:9pt;mso-wrap-distance-bottom:0;mso-position-horizontal:absolute;mso-position-horizontal-relative:text;mso-position-vertical:absolute;mso-position-vertical-relative:text;mso-width-percent:0;mso-height-percent:0;mso-width-relative:margin;mso-height-relative:margin;v-text-anchor:middle" o:gfxdata="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" fillcolor="black [3200]" strokecolor="black [480]" strokeweight="1pt">
                 <v:textbox>
                   <w:txbxContent>
                     <w:p>
@@ -12988,28 +13021,22 @@
       <w:r>
         <w:rPr>
           <w:rFonts w:asciiTheme="majorBidi" w:hAnsiTheme="majorBidi" w:cstheme="majorBidi"/>
-          <w:sz w:val="28"/>
-          <w:szCs w:val="28"/>
-        </w:rPr>
-        <w:t xml:space="preserve"> </w:t>
-      </w:r>
-      <w:proofErr w:type="spellStart"/>
-      <w:r>
-        <w:rPr>
-          <w:rFonts w:asciiTheme="majorBidi" w:hAnsiTheme="majorBidi" w:cstheme="majorBidi"/>
-          <w:sz w:val="28"/>
-          <w:szCs w:val="28"/>
-        </w:rPr>
-        <w:t>never</w:t>
-      </w:r>
-      <w:proofErr w:type="spellEnd"/>
-      <w:r>
-        <w:rPr>
-          <w:rFonts w:asciiTheme="majorBidi" w:hAnsiTheme="majorBidi" w:cstheme="majorBidi"/>
-          <w:sz w:val="28"/>
-          <w:szCs w:val="28"/>
-        </w:rPr>
-        <w:t xml:space="preserve"> run unless explicitly requested.</w:t>
+          <w:b/>
+          <w:bCs/>
+          <w:i/>
+          <w:iCs/>
+          <w:sz w:val="28"/>
+          <w:szCs w:val="28"/>
+        </w:rPr>
+        <w:t>,</w:t>
+      </w:r>
+      <w:r>
+        <w:rPr>
+          <w:rFonts w:asciiTheme="majorBidi" w:hAnsiTheme="majorBidi" w:cstheme="majorBidi"/>
+          <w:sz w:val="28"/>
+          <w:szCs w:val="28"/>
+        </w:rPr>
+        <w:t xml:space="preserve"> never run unless explicitly requested.</w:t>
       </w:r>
     </w:p>
     <w:p>
@@ -13054,16 +13081,16 @@
         <mc:AlternateContent>
           <mc:Choice Requires="wps">
             <w:drawing>
-              <wp:anchor distT="0" distB="0" distL="114300" distR="114300" simplePos="0" relativeHeight="251675648" behindDoc="0" locked="0" layoutInCell="1" allowOverlap="1" wp14:anchorId="24DED1F1" wp14:editId="2BEDC779">
+              <wp:anchor distT="0" distB="0" distL="114300" distR="114300" simplePos="0" relativeHeight="251675648" behindDoc="0" locked="0" layoutInCell="1" allowOverlap="1" wp14:anchorId="24DED1F1" wp14:editId="1D74F09F">
                 <wp:simplePos x="0" y="0"/>
                 <wp:positionH relativeFrom="column">
-                  <wp:posOffset>238125</wp:posOffset>
+                  <wp:posOffset>236220</wp:posOffset>
                 </wp:positionH>
                 <wp:positionV relativeFrom="paragraph">
                   <wp:posOffset>0</wp:posOffset>
                 </wp:positionV>
-                <wp:extent cx="3505200" cy="1095375"/>
-                <wp:effectExtent l="0" t="0" r="19050" b="28575"/>
+                <wp:extent cx="2240280" cy="784860"/>
+                <wp:effectExtent l="0" t="0" r="26670" b="15240"/>
                 <wp:wrapNone/>
                 <wp:docPr id="17" name="Rectangle 17"/>
                 <wp:cNvGraphicFramePr/>
@@ -13074,7 +13101,7 @@
                       <wps:spPr>
                         <a:xfrm>
                           <a:off x="0" y="0"/>
-                          <a:ext cx="3505200" cy="1095375"/>
+                          <a:ext cx="2240280" cy="784860"/>
                         </a:xfrm>
                         <a:prstGeom prst="rect">
                           <a:avLst/>
@@ -13229,7 +13256,7 @@
           </mc:Choice>
           <mc:Fallback>
             <w:pict>
-              <v:rect w14:anchorId="24DED1F1" id="Rectangle 17" o:spid="_x0000_s1042" style="position:absolute;left:0;text-align:left;margin-left:18.75pt;margin-top:0;width:276pt;height:86.25pt;z-index:251675648;visibility:visible;mso-wrap-style:square;mso-width-percent:0;mso-height-percent:0;mso-wrap-distance-left:9pt;mso-wrap-distance-top:0;mso-wrap-distance-right:9pt;mso-wrap-distance-bottom:0;mso-position-horizontal:absolute;mso-position-horizontal-relative:text;mso-position-vertical:absolute;mso-position-vertical-relative:text;mso-width-percent:0;mso-height-percent:0;mso-width-relative:margin;mso-height-relative:margin;v-text-anchor:middle" o:gfxdata="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" fillcolor="black [3200]" strokecolor="black [480]" strokeweight="1pt">
+              <v:rect w14:anchorId="24DED1F1" id="Rectangle 17" o:spid="_x0000_s1042" style="position:absolute;left:0;text-align:left;margin-left:18.6pt;margin-top:0;width:176.4pt;height:61.8pt;z-index:251675648;visibility:visible;mso-wrap-style:square;mso-width-percent:0;mso-height-percent:0;mso-wrap-distance-left:9pt;mso-wrap-distance-top:0;mso-wrap-distance-right:9pt;mso-wrap-distance-bottom:0;mso-position-horizontal:absolute;mso-position-horizontal-relative:text;mso-position-vertical:absolute;mso-position-vertical-relative:text;mso-width-percent:0;mso-height-percent:0;mso-width-relative:margin;mso-height-relative:margin;v-text-anchor:middle" o:gfxdata="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" fillcolor="black [3200]" strokecolor="black [480]" strokeweight="1pt">
                 <v:textbox>
                   <w:txbxContent>
                     <w:p>
@@ -13364,18 +13391,8 @@
         <w:jc w:val="both"/>
         <w:rPr>
           <w:rFonts w:asciiTheme="majorBidi" w:hAnsiTheme="majorBidi" w:cstheme="majorBidi"/>
-          <w:sz w:val="28"/>
-          <w:szCs w:val="28"/>
-        </w:rPr>
-      </w:pPr>
-    </w:p>
-    <w:p>
-      <w:pPr>
-        <w:jc w:val="both"/>
-        <w:rPr>
-          <w:rFonts w:asciiTheme="majorBidi" w:hAnsiTheme="majorBidi" w:cstheme="majorBidi"/>
-          <w:sz w:val="8"/>
-          <w:szCs w:val="8"/>
+          <w:sz w:val="10"/>
+          <w:szCs w:val="10"/>
         </w:rPr>
       </w:pPr>
     </w:p>
@@ -13578,16 +13595,16 @@
         <mc:AlternateContent>
           <mc:Choice Requires="wps">
             <w:drawing>
-              <wp:anchor distT="0" distB="0" distL="114300" distR="114300" simplePos="0" relativeHeight="251676672" behindDoc="0" locked="0" layoutInCell="1" allowOverlap="1" wp14:anchorId="6E658299" wp14:editId="48C76618">
+              <wp:anchor distT="0" distB="0" distL="114300" distR="114300" simplePos="0" relativeHeight="251676672" behindDoc="0" locked="0" layoutInCell="1" allowOverlap="1" wp14:anchorId="6E658299" wp14:editId="2D9B3053">
                 <wp:simplePos x="0" y="0"/>
                 <wp:positionH relativeFrom="column">
-                  <wp:posOffset>-28575</wp:posOffset>
+                  <wp:posOffset>-30479</wp:posOffset>
                 </wp:positionH>
                 <wp:positionV relativeFrom="paragraph">
-                  <wp:posOffset>271145</wp:posOffset>
+                  <wp:posOffset>272415</wp:posOffset>
                 </wp:positionV>
-                <wp:extent cx="2962275" cy="1857375"/>
-                <wp:effectExtent l="0" t="0" r="28575" b="28575"/>
+                <wp:extent cx="624840" cy="1857375"/>
+                <wp:effectExtent l="0" t="0" r="22860" b="28575"/>
                 <wp:wrapNone/>
                 <wp:docPr id="18" name="Rectangle 18"/>
                 <wp:cNvGraphicFramePr/>
@@ -13598,7 +13615,7 @@
                       <wps:spPr>
                         <a:xfrm>
                           <a:off x="0" y="0"/>
-                          <a:ext cx="2962275" cy="1857375"/>
+                          <a:ext cx="624840" cy="1857375"/>
                         </a:xfrm>
                         <a:prstGeom prst="rect">
                           <a:avLst/>
@@ -13827,6 +13844,9 @@
                     </wps:wsp>
                   </a:graphicData>
                 </a:graphic>
+                <wp14:sizeRelH relativeFrom="margin">
+                  <wp14:pctWidth>0</wp14:pctWidth>
+                </wp14:sizeRelH>
                 <wp14:sizeRelV relativeFrom="margin">
                   <wp14:pctHeight>0</wp14:pctHeight>
                 </wp14:sizeRelV>
@@ -13835,7 +13855,7 @@
           </mc:Choice>
           <mc:Fallback>
             <w:pict>
-              <v:rect w14:anchorId="6E658299" id="Rectangle 18" o:spid="_x0000_s1043" style="position:absolute;left:0;text-align:left;margin-left:-2.25pt;margin-top:21.35pt;width:233.25pt;height:146.25pt;z-index:251676672;visibility:visible;mso-wrap-style:square;mso-height-percent:0;mso-wrap-distance-left:9pt;mso-wrap-distance-top:0;mso-wrap-distance-right:9pt;mso-wrap-distance-bottom:0;mso-position-horizontal:absolute;mso-position-horizontal-relative:text;mso-position-vertical:absolute;mso-position-vertical-relative:text;mso-height-percent:0;mso-height-relative:margin;v-text-anchor:middle" o:gfxdata="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" fillcolor="black [3200]" strokecolor="black [480]" strokeweight="1pt">
+              <v:rect w14:anchorId="6E658299" id="Rectangle 18" o:spid="_x0000_s1043" style="position:absolute;left:0;text-align:left;margin-left:-2.4pt;margin-top:21.45pt;width:49.2pt;height:146.25pt;z-index:251676672;visibility:visible;mso-wrap-style:square;mso-width-percent:0;mso-height-percent:0;mso-wrap-distance-left:9pt;mso-wrap-distance-top:0;mso-wrap-distance-right:9pt;mso-wrap-distance-bottom:0;mso-position-horizontal:absolute;mso-position-horizontal-relative:text;mso-position-vertical:absolute;mso-position-vertical-relative:text;mso-width-percent:0;mso-height-percent:0;mso-width-relative:margin;mso-height-relative:margin;v-text-anchor:middle" o:gfxdata="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" fillcolor="black [3200]" strokecolor="black [480]" strokeweight="1pt">
                 <v:textbox>
                   <w:txbxContent>
                     <w:p>
@@ -14492,14 +14512,14 @@
     </w:p>
     <w:p>
       <w:pPr>
-        <w:spacing w:after="80"/>
+        <w:spacing w:after="60"/>
         <w:jc w:val="both"/>
         <w:rPr>
           <w:rFonts w:asciiTheme="majorBidi" w:hAnsiTheme="majorBidi" w:cstheme="majorBidi"/>
           <w:b/>
           <w:bCs/>
-          <w:sz w:val="36"/>
-          <w:szCs w:val="36"/>
+          <w:sz w:val="32"/>
+          <w:szCs w:val="32"/>
         </w:rPr>
       </w:pPr>
       <w:r>
@@ -14507,20 +14527,10 @@
           <w:rFonts w:asciiTheme="majorBidi" w:hAnsiTheme="majorBidi" w:cstheme="majorBidi"/>
           <w:b/>
           <w:bCs/>
-          <w:sz w:val="36"/>
-          <w:szCs w:val="36"/>
-        </w:rPr>
-        <w:t>Starting Execution from a Certain Point</w:t>
-      </w:r>
-      <w:r>
-        <w:rPr>
-          <w:rFonts w:asciiTheme="majorBidi" w:hAnsiTheme="majorBidi" w:cstheme="majorBidi"/>
-          <w:b/>
-          <w:bCs/>
-          <w:sz w:val="36"/>
-          <w:szCs w:val="36"/>
-        </w:rPr>
-        <w:t>:</w:t>
+          <w:sz w:val="32"/>
+          <w:szCs w:val="32"/>
+        </w:rPr>
+        <w:t>Starting Execution from a Certain Point:</w:t>
       </w:r>
     </w:p>
     <w:p>
@@ -14624,7 +14634,7 @@
     </w:p>
     <w:p>
       <w:pPr>
-        <w:spacing w:after="80"/>
+        <w:spacing w:after="60"/>
         <w:jc w:val="both"/>
         <w:rPr>
           <w:rFonts w:asciiTheme="majorBidi" w:hAnsiTheme="majorBidi" w:cstheme="majorBidi"/>
@@ -15706,7 +15716,7 @@
           <w:ilvl w:val="0"/>
           <w:numId w:val="21"/>
         </w:numPr>
-        <w:spacing w:after="80"/>
+        <w:spacing w:after="60"/>
         <w:ind w:left="360"/>
         <w:jc w:val="both"/>
         <w:rPr>
@@ -15761,7 +15771,7 @@
           <w:ilvl w:val="0"/>
           <w:numId w:val="21"/>
         </w:numPr>
-        <w:spacing w:after="80"/>
+        <w:spacing w:after="60"/>
         <w:ind w:left="360"/>
         <w:jc w:val="both"/>
         <w:rPr>
@@ -15808,7 +15818,7 @@
           <w:ilvl w:val="0"/>
           <w:numId w:val="21"/>
         </w:numPr>
-        <w:spacing w:after="80"/>
+        <w:spacing w:after="60"/>
         <w:ind w:left="360"/>
         <w:jc w:val="both"/>
         <w:rPr>
@@ -17091,6 +17101,7 @@
     </w:p>
     <w:p>
       <w:pPr>
+        <w:spacing w:after="60"/>
         <w:jc w:val="both"/>
         <w:rPr>
           <w:rFonts w:asciiTheme="majorBidi" w:hAnsiTheme="majorBidi" w:cstheme="majorBidi"/>
@@ -17424,7 +17435,7 @@
     </w:p>
     <w:p>
       <w:pPr>
-        <w:spacing w:after="80"/>
+        <w:spacing w:after="60"/>
         <w:jc w:val="both"/>
         <w:rPr>
           <w:rFonts w:asciiTheme="majorBidi" w:hAnsiTheme="majorBidi" w:cstheme="majorBidi"/>
@@ -17683,19 +17694,7 @@
                                 <w:sz w:val="28"/>
                                 <w:szCs w:val="28"/>
                               </w:rPr>
-                              <w:t xml:space="preserve">      </w:t>
-                            </w:r>
-                            <w:r>
-                              <w:rPr>
-                                <w:rFonts w:asciiTheme="majorBidi" w:hAnsiTheme="majorBidi" w:cstheme="majorBidi"/>
-                                <w:b/>
-                                <w:bCs/>
-                                <w:i/>
-                                <w:iCs/>
-                                <w:sz w:val="28"/>
-                                <w:szCs w:val="28"/>
-                              </w:rPr>
-                              <w:t xml:space="preserve">  </w:t>
+                              <w:t xml:space="preserve">        </w:t>
                             </w:r>
                             <w:r>
                               <w:rPr>
@@ -18980,7 +18979,27 @@
           <w:sz w:val="28"/>
           <w:szCs w:val="28"/>
         </w:rPr>
-        <w:t>If you define become on a task inside the block, the task-level attribute overrides the block-level attribute. The hierarchy is always: Task &gt; Block &gt; Play/Role.</w:t>
+        <w:t xml:space="preserve">If you define </w:t>
+      </w:r>
+      <w:r>
+        <w:rPr>
+          <w:rFonts w:asciiTheme="majorBidi" w:hAnsiTheme="majorBidi" w:cstheme="majorBidi"/>
+          <w:b/>
+          <w:bCs/>
+          <w:i/>
+          <w:iCs/>
+          <w:sz w:val="28"/>
+          <w:szCs w:val="28"/>
+        </w:rPr>
+        <w:t>become</w:t>
+      </w:r>
+      <w:r>
+        <w:rPr>
+          <w:rFonts w:asciiTheme="majorBidi" w:hAnsiTheme="majorBidi" w:cstheme="majorBidi"/>
+          <w:sz w:val="28"/>
+          <w:szCs w:val="28"/>
+        </w:rPr>
+        <w:t xml:space="preserve"> on a task inside the block, the task-level attribute overrides the block-level attribute. The hierarchy is always: Task &gt; Block &gt; Play/Role.</w:t>
       </w:r>
     </w:p>
     <w:p>
@@ -19258,19 +19277,7 @@
                                 <w:sz w:val="28"/>
                                 <w:szCs w:val="28"/>
                               </w:rPr>
-                              <w:t xml:space="preserve">      </w:t>
-                            </w:r>
-                            <w:r>
-                              <w:rPr>
-                                <w:rFonts w:asciiTheme="majorBidi" w:hAnsiTheme="majorBidi" w:cstheme="majorBidi"/>
-                                <w:b/>
-                                <w:bCs/>
-                                <w:i/>
-                                <w:iCs/>
-                                <w:sz w:val="28"/>
-                                <w:szCs w:val="28"/>
-                              </w:rPr>
-                              <w:t xml:space="preserve">  </w:t>
+                              <w:t xml:space="preserve">        </w:t>
                             </w:r>
                             <w:r>
                               <w:rPr>
@@ -19384,19 +19391,7 @@
                                 <w:sz w:val="28"/>
                                 <w:szCs w:val="28"/>
                               </w:rPr>
-                              <w:t xml:space="preserve">      </w:t>
-                            </w:r>
-                            <w:r>
-                              <w:rPr>
-                                <w:rFonts w:asciiTheme="majorBidi" w:hAnsiTheme="majorBidi" w:cstheme="majorBidi"/>
-                                <w:b/>
-                                <w:bCs/>
-                                <w:i/>
-                                <w:iCs/>
-                                <w:sz w:val="28"/>
-                                <w:szCs w:val="28"/>
-                              </w:rPr>
-                              <w:t xml:space="preserve">  </w:t>
+                              <w:t xml:space="preserve">        </w:t>
                             </w:r>
                             <w:r>
                               <w:rPr>
@@ -19472,19 +19467,7 @@
                                 <w:sz w:val="28"/>
                                 <w:szCs w:val="28"/>
                               </w:rPr>
-                              <w:t xml:space="preserve">      </w:t>
-                            </w:r>
-                            <w:r>
-                              <w:rPr>
-                                <w:rFonts w:asciiTheme="majorBidi" w:hAnsiTheme="majorBidi" w:cstheme="majorBidi"/>
-                                <w:b/>
-                                <w:bCs/>
-                                <w:i/>
-                                <w:iCs/>
-                                <w:sz w:val="28"/>
-                                <w:szCs w:val="28"/>
-                              </w:rPr>
-                              <w:t xml:space="preserve">  </w:t>
+                              <w:t xml:space="preserve">        </w:t>
                             </w:r>
                             <w:r>
                               <w:rPr>
@@ -19607,19 +19590,7 @@
                                 <w:sz w:val="28"/>
                                 <w:szCs w:val="28"/>
                               </w:rPr>
-                              <w:t xml:space="preserve">      </w:t>
-                            </w:r>
-                            <w:r>
-                              <w:rPr>
-                                <w:rFonts w:asciiTheme="majorBidi" w:hAnsiTheme="majorBidi" w:cstheme="majorBidi"/>
-                                <w:b/>
-                                <w:bCs/>
-                                <w:i/>
-                                <w:iCs/>
-                                <w:sz w:val="28"/>
-                                <w:szCs w:val="28"/>
-                              </w:rPr>
-                              <w:t xml:space="preserve">  </w:t>
+                              <w:t xml:space="preserve">        </w:t>
                             </w:r>
                             <w:r>
                               <w:rPr>
@@ -20395,6 +20366,7 @@
     </w:p>
     <w:p>
       <w:pPr>
+        <w:spacing w:after="120"/>
         <w:jc w:val="both"/>
         <w:rPr>
           <w:rFonts w:asciiTheme="majorBidi" w:hAnsiTheme="majorBidi" w:cstheme="majorBidi"/>
@@ -20495,7 +20467,67 @@
           <w:sz w:val="28"/>
           <w:szCs w:val="28"/>
         </w:rPr>
-        <w:t xml:space="preserve"> → If you put a when statement on a block, Ansible evaluates that condition before executing any task inside the block. If it evaluates to false, the entire block (including rescue and always) is skipped.</w:t>
+        <w:t xml:space="preserve"> → If you put a </w:t>
+      </w:r>
+      <w:r>
+        <w:rPr>
+          <w:rFonts w:asciiTheme="majorBidi" w:hAnsiTheme="majorBidi" w:cstheme="majorBidi"/>
+          <w:b/>
+          <w:bCs/>
+          <w:i/>
+          <w:iCs/>
+          <w:sz w:val="28"/>
+          <w:szCs w:val="28"/>
+        </w:rPr>
+        <w:t>when</w:t>
+      </w:r>
+      <w:r>
+        <w:rPr>
+          <w:rFonts w:asciiTheme="majorBidi" w:hAnsiTheme="majorBidi" w:cstheme="majorBidi"/>
+          <w:sz w:val="28"/>
+          <w:szCs w:val="28"/>
+        </w:rPr>
+        <w:t xml:space="preserve"> statement on a block, Ansible evaluates that condition before executing any task inside the block. If it evaluates to false, the entire block (including </w:t>
+      </w:r>
+      <w:r>
+        <w:rPr>
+          <w:rFonts w:asciiTheme="majorBidi" w:hAnsiTheme="majorBidi" w:cstheme="majorBidi"/>
+          <w:b/>
+          <w:bCs/>
+          <w:i/>
+          <w:iCs/>
+          <w:sz w:val="28"/>
+          <w:szCs w:val="28"/>
+        </w:rPr>
+        <w:t>rescue</w:t>
+      </w:r>
+      <w:r>
+        <w:rPr>
+          <w:rFonts w:asciiTheme="majorBidi" w:hAnsiTheme="majorBidi" w:cstheme="majorBidi"/>
+          <w:sz w:val="28"/>
+          <w:szCs w:val="28"/>
+        </w:rPr>
+        <w:t xml:space="preserve"> and </w:t>
+      </w:r>
+      <w:r>
+        <w:rPr>
+          <w:rFonts w:asciiTheme="majorBidi" w:hAnsiTheme="majorBidi" w:cstheme="majorBidi"/>
+          <w:b/>
+          <w:bCs/>
+          <w:i/>
+          <w:iCs/>
+          <w:sz w:val="28"/>
+          <w:szCs w:val="28"/>
+        </w:rPr>
+        <w:t>always</w:t>
+      </w:r>
+      <w:r>
+        <w:rPr>
+          <w:rFonts w:asciiTheme="majorBidi" w:hAnsiTheme="majorBidi" w:cstheme="majorBidi"/>
+          <w:sz w:val="28"/>
+          <w:szCs w:val="28"/>
+        </w:rPr>
+        <w:t>) is skipped.</w:t>
       </w:r>
     </w:p>
     <w:p>
@@ -20529,15 +20561,7 @@
           <w:sz w:val="28"/>
           <w:szCs w:val="28"/>
         </w:rPr>
-        <w:t xml:space="preserve"> </w:t>
-      </w:r>
-      <w:r>
-        <w:rPr>
-          <w:rFonts w:asciiTheme="majorBidi" w:hAnsiTheme="majorBidi" w:cstheme="majorBidi"/>
-          <w:sz w:val="28"/>
-          <w:szCs w:val="28"/>
-        </w:rPr>
-        <w:t xml:space="preserve">→ You cannot put a block inside a block. However, you can call a role or </w:t>
+        <w:t xml:space="preserve"> → You cannot put a block inside a block. However, you can call a role or </w:t>
       </w:r>
       <w:proofErr w:type="spellStart"/>
       <w:r>
@@ -20593,15 +20617,7 @@
           <w:sz w:val="28"/>
           <w:szCs w:val="28"/>
         </w:rPr>
-        <w:t xml:space="preserve"> </w:t>
-      </w:r>
-      <w:r>
-        <w:rPr>
-          <w:rFonts w:asciiTheme="majorBidi" w:hAnsiTheme="majorBidi" w:cstheme="majorBidi"/>
-          <w:sz w:val="28"/>
-          <w:szCs w:val="28"/>
-        </w:rPr>
-        <w:t xml:space="preserve">→ Variables defined inside a block are generally available to the rest of the play, unless they are defined within the </w:t>
+        <w:t xml:space="preserve"> → Variables defined inside a block are generally available to the rest of the play, unless they are defined within the </w:t>
       </w:r>
       <w:r>
         <w:rPr>
@@ -20631,6 +20647,7 @@
           <w:ilvl w:val="0"/>
           <w:numId w:val="21"/>
         </w:numPr>
+        <w:spacing w:after="120"/>
         <w:ind w:left="360"/>
         <w:jc w:val="both"/>
         <w:rPr>
@@ -20963,31 +20980,7 @@
           <w:sz w:val="28"/>
           <w:szCs w:val="28"/>
         </w:rPr>
-        <w:t>Always k</w:t>
-      </w:r>
-      <w:r>
-        <w:rPr>
-          <w:rFonts w:asciiTheme="majorBidi" w:hAnsiTheme="majorBidi" w:cstheme="majorBidi"/>
-          <w:sz w:val="28"/>
-          <w:szCs w:val="28"/>
-        </w:rPr>
-        <w:t>eep playbooks small</w:t>
-      </w:r>
-      <w:r>
-        <w:rPr>
-          <w:rFonts w:asciiTheme="majorBidi" w:hAnsiTheme="majorBidi" w:cstheme="majorBidi"/>
-          <w:sz w:val="28"/>
-          <w:szCs w:val="28"/>
-        </w:rPr>
-        <w:t xml:space="preserve"> - </w:t>
-      </w:r>
-      <w:r>
-        <w:rPr>
-          <w:rFonts w:asciiTheme="majorBidi" w:hAnsiTheme="majorBidi" w:cstheme="majorBidi"/>
-          <w:sz w:val="28"/>
-          <w:szCs w:val="28"/>
-        </w:rPr>
-        <w:t>Use roles.</w:t>
+        <w:t>Always keep playbooks small - Use roles.</w:t>
       </w:r>
     </w:p>
     <w:sectPr>
@@ -21001,7 +20994,7 @@
 </file>
 
 <file path=word/numbering.xml><?xml version="1.0" encoding="utf-8"?>
-<w:numbering xmlns:wpc="http://schemas.microsoft.com/office/word/2010/wordprocessingCanvas" xmlns:cx="http://schemas.microsoft.com/office/drawing/2014/chartex" xmlns:cx1="http://schemas.microsoft.com/office/drawing/2015/9/8/chartex" xmlns:cx2="http://schemas.microsoft.com/office/drawing/2015/10/21/chartex" xmlns:cx3="http://schemas.microsoft.com/office/drawing/2016/5/9/chartex" xmlns:cx4="http://schemas.microsoft.com/office/drawing/2016/5/10/chartex" xmlns:cx5="http://schemas.microsoft.com/office/drawing/2016/5/11/chartex" xmlns:cx6="http://schemas.microsoft.com/office/drawing/2016/5/12/chartex" xmlns:cx7="http://schemas.microsoft.com/office/drawing/2016/5/13/chartex" xmlns:cx8="http://schemas.microsoft.com/office/drawing/2016/5/14/chartex" xmlns:mc="http://schemas.openxmlformats.org/markup-compatibility/2006" xmlns:aink="http://schemas.microsoft.com/office/drawing/2016/ink" xmlns:am3d="http://schemas.microsoft.com/office/drawing/2017/model3d" xmlns:o="urn:schemas-microsoft-com:office:office" xmlns:oel="http://schemas.microsoft.com/office/2019/extlst" xmlns:r="http://schemas.openxmlformats.org/officeDocument/2006/relationships" xmlns:m="http://schemas.openxmlformats.org/officeDocument/2006/math" xmlns:v="urn:schemas-microsoft-com:vml" xmlns:wp14="http://schemas.microsoft.com/office/word/2010/wordprocessingDrawing" xmlns:wp="http://schemas.openxmlformats.org/drawingml/2006/wordprocessingDrawing" xmlns:w10="urn:schemas-microsoft-com:office:word" xmlns:w="http://schemas.openxmlformats.org/wordprocessingml/2006/main" xmlns:w14="http://schemas.microsoft.com/office/word/2010/wordml" xmlns:w15="http://schemas.microsoft.com/office/word/2012/wordml" xmlns:w16cex="http://schemas.microsoft.com/office/word/2018/wordml/cex" xmlns:w16cid="http://schemas.microsoft.com/office/word/2016/wordml/cid" xmlns:w16="http://schemas.microsoft.com/office/word/2018/wordml" xmlns:w16sdtdh="http://schemas.microsoft.com/office/word/2020/wordml/sdtdatahash" xmlns:w16se="http://schemas.microsoft.com/office/word/2015/wordml/symex" xmlns:wpg="http://schemas.microsoft.com/office/word/2010/wordprocessingGroup" xmlns:wpi="http://schemas.microsoft.com/office/word/2010/wordprocessingInk" xmlns:wne="http://schemas.microsoft.com/office/word/2006/wordml" xmlns:wps="http://schemas.microsoft.com/office/word/2010/wordprocessingShape" mc:Ignorable="w14 w15 w16se w16cid w16 w16cex w16sdtdh wp14">
+<w:numbering xmlns:wpc="http://schemas.microsoft.com/office/word/2010/wordprocessingCanvas" xmlns:cx="http://schemas.microsoft.com/office/drawing/2014/chartex" xmlns:cx1="http://schemas.microsoft.com/office/drawing/2015/9/8/chartex" xmlns:cx2="http://schemas.microsoft.com/office/drawing/2015/10/21/chartex" xmlns:cx3="http://schemas.microsoft.com/office/drawing/2016/5/9/chartex" xmlns:cx4="http://schemas.microsoft.com/office/drawing/2016/5/10/chartex" xmlns:cx5="http://schemas.microsoft.com/office/drawing/2016/5/11/chartex" xmlns:cx6="http://schemas.microsoft.com/office/drawing/2016/5/12/chartex" xmlns:cx7="http://schemas.microsoft.com/office/drawing/2016/5/13/chartex" xmlns:cx8="http://schemas.microsoft.com/office/drawing/2016/5/14/chartex" xmlns:mc="http://schemas.openxmlformats.org/markup-compatibility/2006" xmlns:aink="http://schemas.microsoft.com/office/drawing/2016/ink" xmlns:am3d="http://schemas.microsoft.com/office/drawing/2017/model3d" xmlns:o="urn:schemas-microsoft-com:office:office" xmlns:oel="http://schemas.microsoft.com/office/2019/extlst" xmlns:r="http://schemas.openxmlformats.org/officeDocument/2006/relationships" xmlns:m="http://schemas.openxmlformats.org/officeDocument/2006/math" xmlns:v="urn:schemas-microsoft-com:vml" xmlns:wp14="http://schemas.microsoft.com/office/word/2010/wordprocessingDrawing" xmlns:wp="http://schemas.openxmlformats.org/drawingml/2006/wordprocessingDrawing" xmlns:w10="urn:schemas-microsoft-com:office:word" xmlns:w="http://schemas.openxmlformats.org/wordprocessingml/2006/main" xmlns:w14="http://schemas.microsoft.com/office/word/2010/wordml" xmlns:w15="http://schemas.microsoft.com/office/word/2012/wordml" xmlns:w16cex="http://schemas.microsoft.com/office/word/2018/wordml/cex" xmlns:w16cid="http://schemas.microsoft.com/office/word/2016/wordml/cid" xmlns:w16="http://schemas.microsoft.com/office/word/2018/wordml" xmlns:w16du="http://schemas.microsoft.com/office/word/2023/wordml/word16du" xmlns:w16sdtdh="http://schemas.microsoft.com/office/word/2020/wordml/sdtdatahash" xmlns:w16sdtfl="http://schemas.microsoft.com/office/word/2024/wordml/sdtformatlock" xmlns:w16se="http://schemas.microsoft.com/office/word/2015/wordml/symex" xmlns:wpg="http://schemas.microsoft.com/office/word/2010/wordprocessingGroup" xmlns:wpi="http://schemas.microsoft.com/office/word/2010/wordprocessingInk" xmlns:wne="http://schemas.microsoft.com/office/word/2006/wordml" xmlns:wps="http://schemas.microsoft.com/office/word/2010/wordprocessingShape" mc:Ignorable="w14 w15 w16se w16cid w16 w16cex w16sdtdh w16sdtfl w16du wp14">
   <w:abstractNum w:abstractNumId="0" w15:restartNumberingAfterBreak="0">
     <w:nsid w:val="02052079"/>
     <w:multiLevelType w:val="hybridMultilevel"/>
@@ -23566,7 +23559,7 @@
 </file>
 
 <file path=word/styles.xml><?xml version="1.0" encoding="utf-8"?>
-<w:styles xmlns:mc="http://schemas.openxmlformats.org/markup-compatibility/2006" xmlns:r="http://schemas.openxmlformats.org/officeDocument/2006/relationships" xmlns:w="http://schemas.openxmlformats.org/wordprocessingml/2006/main" xmlns:w14="http://schemas.microsoft.com/office/word/2010/wordml" xmlns:w15="http://schemas.microsoft.com/office/word/2012/wordml" xmlns:w16cex="http://schemas.microsoft.com/office/word/2018/wordml/cex" xmlns:w16cid="http://schemas.microsoft.com/office/word/2016/wordml/cid" xmlns:w16="http://schemas.microsoft.com/office/word/2018/wordml" xmlns:w16sdtdh="http://schemas.microsoft.com/office/word/2020/wordml/sdtdatahash" xmlns:w16se="http://schemas.microsoft.com/office/word/2015/wordml/symex" mc:Ignorable="w14 w15 w16se w16cid w16 w16cex w16sdtdh">
+<w:styles xmlns:mc="http://schemas.openxmlformats.org/markup-compatibility/2006" xmlns:r="http://schemas.openxmlformats.org/officeDocument/2006/relationships" xmlns:w="http://schemas.openxmlformats.org/wordprocessingml/2006/main" xmlns:w14="http://schemas.microsoft.com/office/word/2010/wordml" xmlns:w15="http://schemas.microsoft.com/office/word/2012/wordml" xmlns:w16cex="http://schemas.microsoft.com/office/word/2018/wordml/cex" xmlns:w16cid="http://schemas.microsoft.com/office/word/2016/wordml/cid" xmlns:w16="http://schemas.microsoft.com/office/word/2018/wordml" xmlns:w16du="http://schemas.microsoft.com/office/word/2023/wordml/word16du" xmlns:w16sdtdh="http://schemas.microsoft.com/office/word/2020/wordml/sdtdatahash" xmlns:w16sdtfl="http://schemas.microsoft.com/office/word/2024/wordml/sdtformatlock" xmlns:w16se="http://schemas.microsoft.com/office/word/2015/wordml/symex" mc:Ignorable="w14 w15 w16se w16cid w16 w16cex w16sdtdh w16sdtfl w16du">
   <w:docDefaults>
     <w:rPrDefault>
       <w:rPr>
@@ -24300,4 +24293,16 @@
     </a:ext>
   </a:extLst>
 </a:theme>
+</file>
+
+<file path=customXml/item1.xml><?xml version="1.0" encoding="utf-8"?>
+<b:Sources xmlns:b="http://schemas.openxmlformats.org/officeDocument/2006/bibliography" xmlns="http://schemas.openxmlformats.org/officeDocument/2006/bibliography" SelectedStyle="\APASixthEditionOfficeOnline.xsl" StyleName="APA" Version="6"/>
+</file>
+
+<file path=customXml/itemProps1.xml><?xml version="1.0" encoding="utf-8"?>
+<ds:datastoreItem xmlns:ds="http://schemas.openxmlformats.org/officeDocument/2006/customXml" ds:itemID="{13E562B3-4FFA-42B3-8A4B-F9990C3405B9}">
+  <ds:schemaRefs>
+    <ds:schemaRef ds:uri="http://schemas.openxmlformats.org/officeDocument/2006/bibliography"/>
+  </ds:schemaRefs>
+</ds:datastoreItem>
 </file>
</xml_diff>